<commit_message>
Atualizamos o README e o arquivo Word
</commit_message>
<xml_diff>
--- a/Dicas texto.docx
+++ b/Dicas texto.docx
@@ -28,6 +28,35 @@
         </w:rPr>
         <w:t>.</w:t>
       </w:r>
+    </w:p>
+    <w:p>
+      <w:pPr>
+        <w:rPr>
+          <w:rFonts w:ascii="Times New Roman" w:hAnsi="Times New Roman" w:cs="Times New Roman"/>
+        </w:rPr>
+      </w:pPr>
+    </w:p>
+    <w:p>
+      <w:pPr>
+        <w:rPr>
+          <w:rFonts w:ascii="Times New Roman" w:hAnsi="Times New Roman" w:cs="Times New Roman"/>
+        </w:rPr>
+      </w:pPr>
+      <w:proofErr w:type="spellStart"/>
+      <w:r>
+        <w:rPr>
+          <w:rFonts w:ascii="Times New Roman" w:hAnsi="Times New Roman" w:cs="Times New Roman"/>
+        </w:rPr>
+        <w:t>Hahahahah</w:t>
+      </w:r>
+      <w:proofErr w:type="spellEnd"/>
+    </w:p>
+    <w:p>
+      <w:pPr>
+        <w:rPr>
+          <w:rFonts w:ascii="Times New Roman" w:hAnsi="Times New Roman" w:cs="Times New Roman"/>
+        </w:rPr>
+      </w:pPr>
     </w:p>
     <w:sectPr>
       <w:pgSz w:w="11906" w:h="16838"/>

</xml_diff>